<commit_message>
Split Gokulashtami timeline entry into 2024 member / 2025 coordinator
Matches the resume's leadership bullet, which now distinguishes the two
years rather than listing only the coordinator role.
</commit_message>
<xml_diff>
--- a/RESUME.docx
+++ b/RESUME.docx
@@ -1294,7 +1294,33 @@
           <w:sz w:val="18"/>
           <w:szCs w:val="18"/>
         </w:rPr>
-        <w:t xml:space="preserve"> — led drawing/painting for Swachhata Hi Seva at Ettimadai Railway Station and a school camp; Gokulashtami decoration coordinator.</w:t>
+        <w:t xml:space="preserve"> — led drawing/painting for Swachhata Hi Seva at Ettimadai Railway Station and a school camp.</w:t>
+      </w:r>
+    </w:p>
+    <w:p>
+      <w:pPr>
+        <w:pStyle w:val="ListParagraph"/>
+        <w:numPr>
+          <w:ilvl w:val="0"/>
+          <w:numId w:val="2"/>
+        </w:numPr>
+        <w:spacing w:after="16"/>
+      </w:pPr>
+      <w:r>
+        <w:rPr>
+          <w:b/>
+          <w:bCs/>
+          <w:sz w:val="18"/>
+          <w:szCs w:val="18"/>
+        </w:rPr>
+        <w:t>Gokulashtami celebrations</w:t>
+      </w:r>
+      <w:r>
+        <w:rPr>
+          <w:sz w:val="18"/>
+          <w:szCs w:val="18"/>
+        </w:rPr>
+        <w:t xml:space="preserve"> — team member (2024), decoration coordinator (2025).</w:t>
       </w:r>
     </w:p>
     <w:sectPr>
@@ -1310,10 +1336,10 @@
 <file path=word/numbering.xml><?xml version="1.0" encoding="utf-8"?>
 <w:numbering xmlns:wpc="http://schemas.microsoft.com/office/word/2010/wordprocessingCanvas" xmlns:cx="http://schemas.microsoft.com/office/drawing/2014/chartex" xmlns:cx1="http://schemas.microsoft.com/office/drawing/2015/9/8/chartex" xmlns:cx2="http://schemas.microsoft.com/office/drawing/2015/10/21/chartex" xmlns:cx3="http://schemas.microsoft.com/office/drawing/2016/5/9/chartex" xmlns:cx4="http://schemas.microsoft.com/office/drawing/2016/5/10/chartex" xmlns:cx5="http://schemas.microsoft.com/office/drawing/2016/5/11/chartex" xmlns:cx6="http://schemas.microsoft.com/office/drawing/2016/5/12/chartex" xmlns:cx7="http://schemas.microsoft.com/office/drawing/2016/5/13/chartex" xmlns:cx8="http://schemas.microsoft.com/office/drawing/2016/5/14/chartex" xmlns:mc="http://schemas.openxmlformats.org/markup-compatibility/2006" xmlns:aink="http://schemas.microsoft.com/office/drawing/2016/ink" xmlns:am3d="http://schemas.microsoft.com/office/drawing/2017/model3d" xmlns:o="urn:schemas-microsoft-com:office:office" xmlns:oel="http://schemas.microsoft.com/office/2019/extlst" xmlns:r="http://schemas.openxmlformats.org/officeDocument/2006/relationships" xmlns:m="http://schemas.openxmlformats.org/officeDocument/2006/math" xmlns:v="urn:schemas-microsoft-com:vml" xmlns:wp14="http://schemas.microsoft.com/office/word/2010/wordprocessingDrawing" xmlns:wp="http://schemas.openxmlformats.org/drawingml/2006/wordprocessingDrawing" xmlns:w10="urn:schemas-microsoft-com:office:word" xmlns:w="http://schemas.openxmlformats.org/wordprocessingml/2006/main" xmlns:w14="http://schemas.microsoft.com/office/word/2010/wordml" xmlns:w15="http://schemas.microsoft.com/office/word/2012/wordml" xmlns:w16cex="http://schemas.microsoft.com/office/word/2018/wordml/cex" xmlns:w16cid="http://schemas.microsoft.com/office/word/2016/wordml/cid" xmlns:w16="http://schemas.microsoft.com/office/word/2018/wordml" xmlns:w16du="http://schemas.microsoft.com/office/word/2023/wordml/word16du" xmlns:w16sdtdh="http://schemas.microsoft.com/office/word/2020/wordml/sdtdatahash" xmlns:w16sdtfl="http://schemas.microsoft.com/office/word/2024/wordml/sdtformatlock" xmlns:w16se="http://schemas.microsoft.com/office/word/2015/wordml/symex" xmlns:wpg="http://schemas.microsoft.com/office/word/2010/wordprocessingGroup" xmlns:wpi="http://schemas.microsoft.com/office/word/2010/wordprocessingInk" xmlns:wne="http://schemas.microsoft.com/office/word/2006/wordml" xmlns:wps="http://schemas.microsoft.com/office/word/2010/wordprocessingShape" mc:Ignorable="w14 w15 w16se w16cid w16 w16cex w16sdtdh w16sdtfl w16du wp14">
   <w:abstractNum w:abstractNumId="0" w15:restartNumberingAfterBreak="0">
-    <w:nsid w:val="2C2E2DB1"/>
+    <w:nsid w:val="11B74356"/>
     <w:multiLevelType w:val="hybridMultilevel"/>
-    <w:tmpl w:val="3814BA26"/>
-    <w:lvl w:ilvl="0" w:tplc="CD06D58E">
+    <w:tmpl w:val="3CD63FDE"/>
+    <w:lvl w:ilvl="0" w:tplc="B47C931C">
       <w:start w:val="1"/>
       <w:numFmt w:val="bullet"/>
       <w:lvlText w:val="●"/>
@@ -1322,7 +1348,7 @@
         <w:ind w:left="720" w:hanging="360"/>
       </w:pPr>
     </w:lvl>
-    <w:lvl w:ilvl="1" w:tplc="4C386730">
+    <w:lvl w:ilvl="1" w:tplc="24BE0C66">
       <w:start w:val="1"/>
       <w:numFmt w:val="bullet"/>
       <w:lvlText w:val="○"/>
@@ -1331,7 +1357,7 @@
         <w:ind w:left="1440" w:hanging="360"/>
       </w:pPr>
     </w:lvl>
-    <w:lvl w:ilvl="2" w:tplc="1A6CFE88">
+    <w:lvl w:ilvl="2" w:tplc="E0F6E650">
       <w:start w:val="1"/>
       <w:numFmt w:val="bullet"/>
       <w:lvlText w:val="■"/>
@@ -1340,7 +1366,7 @@
         <w:ind w:left="2160" w:hanging="360"/>
       </w:pPr>
     </w:lvl>
-    <w:lvl w:ilvl="3" w:tplc="4E86C74A">
+    <w:lvl w:ilvl="3" w:tplc="503801CA">
       <w:start w:val="1"/>
       <w:numFmt w:val="bullet"/>
       <w:lvlText w:val="●"/>
@@ -1349,7 +1375,7 @@
         <w:ind w:left="2880" w:hanging="360"/>
       </w:pPr>
     </w:lvl>
-    <w:lvl w:ilvl="4" w:tplc="DAFA390E">
+    <w:lvl w:ilvl="4" w:tplc="21368BDC">
       <w:start w:val="1"/>
       <w:numFmt w:val="bullet"/>
       <w:lvlText w:val="○"/>
@@ -1358,7 +1384,7 @@
         <w:ind w:left="3600" w:hanging="360"/>
       </w:pPr>
     </w:lvl>
-    <w:lvl w:ilvl="5" w:tplc="1B3C2C12">
+    <w:lvl w:ilvl="5" w:tplc="F85A59D0">
       <w:start w:val="1"/>
       <w:numFmt w:val="bullet"/>
       <w:lvlText w:val="■"/>
@@ -1367,7 +1393,7 @@
         <w:ind w:left="4320" w:hanging="360"/>
       </w:pPr>
     </w:lvl>
-    <w:lvl w:ilvl="6" w:tplc="1E366938">
+    <w:lvl w:ilvl="6" w:tplc="DFCADDD6">
       <w:start w:val="1"/>
       <w:numFmt w:val="bullet"/>
       <w:lvlText w:val="●"/>
@@ -1376,7 +1402,7 @@
         <w:ind w:left="5040" w:hanging="360"/>
       </w:pPr>
     </w:lvl>
-    <w:lvl w:ilvl="7" w:tplc="0FFC8470">
+    <w:lvl w:ilvl="7" w:tplc="F6C0DA32">
       <w:start w:val="1"/>
       <w:numFmt w:val="bullet"/>
       <w:lvlText w:val="●"/>
@@ -1385,7 +1411,7 @@
         <w:ind w:left="5760" w:hanging="360"/>
       </w:pPr>
     </w:lvl>
-    <w:lvl w:ilvl="8" w:tplc="42B81246">
+    <w:lvl w:ilvl="8" w:tplc="73A63FB8">
       <w:start w:val="1"/>
       <w:numFmt w:val="bullet"/>
       <w:lvlText w:val="●"/>
@@ -1396,10 +1422,10 @@
     </w:lvl>
   </w:abstractNum>
   <w:abstractNum w:abstractNumId="1" w15:restartNumberingAfterBreak="0">
-    <w:nsid w:val="51516147"/>
+    <w:nsid w:val="322205D9"/>
     <w:multiLevelType w:val="hybridMultilevel"/>
-    <w:tmpl w:val="50924BF4"/>
-    <w:lvl w:ilvl="0" w:tplc="401E4DF8">
+    <w:tmpl w:val="1A86FA2E"/>
+    <w:lvl w:ilvl="0" w:tplc="6E508C1E">
       <w:start w:val="1"/>
       <w:numFmt w:val="bullet"/>
       <w:lvlText w:val="•"/>
@@ -1408,54 +1434,54 @@
         <w:ind w:left="288" w:hanging="215"/>
       </w:pPr>
     </w:lvl>
-    <w:lvl w:ilvl="1" w:tplc="74009D3C">
+    <w:lvl w:ilvl="1" w:tplc="F8AA409E">
       <w:numFmt w:val="decimal"/>
       <w:lvlText w:val=""/>
       <w:lvlJc w:val="left"/>
     </w:lvl>
-    <w:lvl w:ilvl="2" w:tplc="A38487A6">
+    <w:lvl w:ilvl="2" w:tplc="733E7664">
       <w:numFmt w:val="decimal"/>
       <w:lvlText w:val=""/>
       <w:lvlJc w:val="left"/>
     </w:lvl>
-    <w:lvl w:ilvl="3" w:tplc="55AC3AC4">
+    <w:lvl w:ilvl="3" w:tplc="7632E9C2">
       <w:numFmt w:val="decimal"/>
       <w:lvlText w:val=""/>
       <w:lvlJc w:val="left"/>
     </w:lvl>
-    <w:lvl w:ilvl="4" w:tplc="B92E9DA4">
+    <w:lvl w:ilvl="4" w:tplc="66C2970A">
       <w:numFmt w:val="decimal"/>
       <w:lvlText w:val=""/>
       <w:lvlJc w:val="left"/>
     </w:lvl>
-    <w:lvl w:ilvl="5" w:tplc="2BA6EEA2">
+    <w:lvl w:ilvl="5" w:tplc="CA3E3974">
       <w:numFmt w:val="decimal"/>
       <w:lvlText w:val=""/>
       <w:lvlJc w:val="left"/>
     </w:lvl>
-    <w:lvl w:ilvl="6" w:tplc="7E40D1C2">
+    <w:lvl w:ilvl="6" w:tplc="5F1E97CC">
       <w:numFmt w:val="decimal"/>
       <w:lvlText w:val=""/>
       <w:lvlJc w:val="left"/>
     </w:lvl>
-    <w:lvl w:ilvl="7" w:tplc="AF5AC24A">
+    <w:lvl w:ilvl="7" w:tplc="DD2A494A">
       <w:numFmt w:val="decimal"/>
       <w:lvlText w:val=""/>
       <w:lvlJc w:val="left"/>
     </w:lvl>
-    <w:lvl w:ilvl="8" w:tplc="2E6C3266">
+    <w:lvl w:ilvl="8" w:tplc="F470301C">
       <w:numFmt w:val="decimal"/>
       <w:lvlText w:val=""/>
       <w:lvlJc w:val="left"/>
     </w:lvl>
   </w:abstractNum>
-  <w:num w:numId="1" w16cid:durableId="2135446003">
+  <w:num w:numId="1" w16cid:durableId="773600144">
     <w:abstractNumId w:val="0"/>
     <w:lvlOverride w:ilvl="0">
       <w:startOverride w:val="1"/>
     </w:lvlOverride>
   </w:num>
-  <w:num w:numId="2" w16cid:durableId="1149134631">
+  <w:num w:numId="2" w16cid:durableId="1363096611">
     <w:abstractNumId w:val="1"/>
     <w:lvlOverride w:ilvl="0">
       <w:startOverride w:val="1"/>

</xml_diff>